<commit_message>
Add hero portrait with rounded-square framing.
Bring the watercolor avatar into the hero layout and tune crop/palette so the first viewport feels more personal without a circular crop.

Co-authored-by: Cursor <cursoragent@cursor.com>
</commit_message>
<xml_diff>
--- a/public/Andrew-Macdonald-Resume.docx
+++ b/public/Andrew-Macdonald-Resume.docx
@@ -91,7 +91,7 @@
               <w:spacing w:after="4" w:line="220"/>
               <w:jc w:val="right"/>
             </w:pPr>
-            <w:hyperlink w:history="1" r:id="rId33t_vjpwgnn6nabjg6k96">
+            <w:hyperlink w:history="1" r:id="rIdybwhoty3163svijdd4mf1">
               <w:r>
                 <w:rPr>
                   <w:rFonts w:ascii="Calibri" w:cs="Calibri" w:eastAsia="Calibri" w:hAnsi="Calibri"/>
@@ -109,7 +109,7 @@
               <w:spacing w:after="0" w:line="220"/>
               <w:jc w:val="right"/>
             </w:pPr>
-            <w:hyperlink w:history="1" r:id="rIdwjj307db638hb6j0-y9ev">
+            <w:hyperlink w:history="1" r:id="rIdjndu5ba4oglzmzpjohawz">
               <w:r>
                 <w:rPr>
                   <w:rFonts w:ascii="Calibri" w:cs="Calibri" w:eastAsia="Calibri" w:hAnsi="Calibri"/>
@@ -130,7 +130,7 @@
               </w:rPr>
               <w:t xml:space="preserve">  ·  </w:t>
             </w:r>
-            <w:hyperlink w:history="1" r:id="rIdfnsd8zqh7otpr3ynf6qne">
+            <w:hyperlink w:history="1" r:id="rId-hdztd7vnqvedqvblfoaw">
               <w:r>
                 <w:rPr>
                   <w:rFonts w:ascii="Calibri" w:cs="Calibri" w:eastAsia="Calibri" w:hAnsi="Calibri"/>
@@ -151,7 +151,7 @@
               </w:rPr>
               <w:t xml:space="preserve">  ·  </w:t>
             </w:r>
-            <w:hyperlink w:history="1" r:id="rIdav-2cbetkvzpcjggkwzfd">
+            <w:hyperlink w:history="1" r:id="rIdgwkyevvbldhzclwhw_ara">
               <w:r>
                 <w:rPr>
                   <w:rFonts w:ascii="Calibri" w:cs="Calibri" w:eastAsia="Calibri" w:hAnsi="Calibri"/>
@@ -215,7 +215,7 @@
           <w:sz w:val="21"/>
           <w:szCs w:val="21"/>
         </w:rPr>
-        <w:t xml:space="preserve">Relationship-builder who ships. I sold real estate, led field crews in oil and gas, then taught myself to ship AI products — TrendForge is live in production. I learn fast in messy environments, stay calm with customers, and want an in-office product or solutions engineering seat in Toronto.</w:t>
+        <w:t xml:space="preserve">Relationship-builder who ships. Path runs real estate → oil &amp; gas crews → coding and AI. TrendForge is live in production; Operator Goods (operator apparel + Notes/Lexicon on the agent loop) is the current build. I learn fast in messy environments, keep judgment at the gate, and ship in public from Grand Valley, Ontario.</w:t>
       </w:r>
     </w:p>
     <w:p>
@@ -250,7 +250,7 @@
           <w:sz w:val="21"/>
           <w:szCs w:val="21"/>
         </w:rPr>
-        <w:t xml:space="preserve">Customer conversations · negotiation · crew leadership · TypeScript · React · Python · Vite · Vercel · xAI / Grok APIs · local LLMs · digital ads / funnel building</w:t>
+        <w:t xml:space="preserve">Customer conversations · negotiation · crew leadership · TypeScript · React · Python · Vite · Vercel · Shopify / Hydrogen patterns · xAI / Grok APIs · agent loops · digital ads / funnel building</w:t>
       </w:r>
     </w:p>
     <w:p>
@@ -290,7 +290,7 @@
           <w:sz w:val="22"/>
           <w:szCs w:val="22"/>
         </w:rPr>
-        <w:t xml:space="preserve">Product engineer — TrendForge</w:t>
+        <w:t xml:space="preserve">Operator Goods — storefront + Notes</w:t>
       </w:r>
       <w:r>
         <w:rPr>
@@ -301,7 +301,7 @@
           <w:sz w:val="20"/>
           <w:szCs w:val="20"/>
         </w:rPr>
-        <w:t xml:space="preserve">	2025 – Present</w:t>
+        <w:t xml:space="preserve">	2026 – Present</w:t>
       </w:r>
     </w:p>
     <w:p>
@@ -319,7 +319,102 @@
         </w:rPr>
         <w:t xml:space="preserve">Independent  ·  </w:t>
       </w:r>
-      <w:hyperlink w:history="1" r:id="rIdmrrj2kzyagvdfcs7eq0tw">
+      <w:r>
+        <w:rPr>
+          <w:rFonts w:ascii="Calibri" w:cs="Calibri" w:eastAsia="Calibri" w:hAnsi="Calibri"/>
+          <w:i/>
+          <w:iCs/>
+          <w:color w:val="5C6570"/>
+          <w:sz w:val="20"/>
+          <w:szCs w:val="20"/>
+        </w:rPr>
+        <w:t xml:space="preserve">operator apparel &amp; desk kit  ·  Notes + Lexicon (Call, Gate, Scaffold, Charter, Taste, Judgment)</w:t>
+      </w:r>
+    </w:p>
+    <w:p>
+      <w:pPr>
+        <w:pStyle w:val="ListParagraph"/>
+        <w:numPr>
+          <w:ilvl w:val="0"/>
+          <w:numId w:val="2"/>
+        </w:numPr>
+        <w:spacing w:after="24" w:line="230"/>
+      </w:pPr>
+      <w:r>
+        <w:rPr>
+          <w:rFonts w:ascii="Calibri" w:cs="Calibri" w:eastAsia="Calibri" w:hAnsi="Calibri"/>
+          <w:color w:val="222222"/>
+          <w:sz w:val="21"/>
+          <w:szCs w:val="21"/>
+        </w:rPr>
+        <w:t xml:space="preserve">Building a Vite/React storefront (Hydrogen-react patterns) for operator gear; weekly field Notes on Assign → Execute → Review.</w:t>
+      </w:r>
+    </w:p>
+    <w:p>
+      <w:pPr>
+        <w:pStyle w:val="ListParagraph"/>
+        <w:numPr>
+          <w:ilvl w:val="0"/>
+          <w:numId w:val="2"/>
+        </w:numPr>
+        <w:spacing w:after="24" w:line="230"/>
+      </w:pPr>
+      <w:r>
+        <w:rPr>
+          <w:rFonts w:ascii="Calibri" w:cs="Calibri" w:eastAsia="Calibri" w:hAnsi="Calibri"/>
+          <w:color w:val="222222"/>
+          <w:sz w:val="21"/>
+          <w:szCs w:val="21"/>
+        </w:rPr>
+        <w:t xml:space="preserve">Shipped a Lexicon so shared operator terms stay defined once; Shopify Storefront API linking in progress.</w:t>
+      </w:r>
+    </w:p>
+    <w:p>
+      <w:pPr>
+        <w:tabs>
+          <w:tab w:val="right" w:pos="10800"/>
+        </w:tabs>
+        <w:spacing w:after="0" w:before="90" w:line="230"/>
+      </w:pPr>
+      <w:r>
+        <w:rPr>
+          <w:rFonts w:ascii="Calibri" w:cs="Calibri" w:eastAsia="Calibri" w:hAnsi="Calibri"/>
+          <w:b/>
+          <w:bCs/>
+          <w:color w:val="1B3A4B"/>
+          <w:sz w:val="22"/>
+          <w:szCs w:val="22"/>
+        </w:rPr>
+        <w:t xml:space="preserve">Product engineer — TrendForge</w:t>
+      </w:r>
+      <w:r>
+        <w:rPr>
+          <w:rFonts w:ascii="Calibri" w:cs="Calibri" w:eastAsia="Calibri" w:hAnsi="Calibri"/>
+          <w:i/>
+          <w:iCs/>
+          <w:color w:val="5C6570"/>
+          <w:sz w:val="20"/>
+          <w:szCs w:val="20"/>
+        </w:rPr>
+        <w:t xml:space="preserve">	2025 – Present</w:t>
+      </w:r>
+    </w:p>
+    <w:p>
+      <w:pPr>
+        <w:spacing w:after="20" w:line="220"/>
+      </w:pPr>
+      <w:r>
+        <w:rPr>
+          <w:rFonts w:ascii="Calibri" w:cs="Calibri" w:eastAsia="Calibri" w:hAnsi="Calibri"/>
+          <w:i/>
+          <w:iCs/>
+          <w:color w:val="5C6570"/>
+          <w:sz w:val="20"/>
+          <w:szCs w:val="20"/>
+        </w:rPr>
+        <w:t xml:space="preserve">Independent  ·  </w:t>
+      </w:r>
+      <w:hyperlink w:history="1" r:id="rIdctus54ko6npgksjq6mlof">
         <w:r>
           <w:rPr>
             <w:rFonts w:ascii="Calibri" w:cs="Calibri" w:eastAsia="Calibri" w:hAnsi="Calibri"/>
@@ -340,7 +435,7 @@
         </w:rPr>
         <w:t xml:space="preserve">  ·  </w:t>
       </w:r>
-      <w:hyperlink w:history="1" r:id="rIds-ajsu4hvt3ayhhjgpow3">
+      <w:hyperlink w:history="1" r:id="rIdfn-oidyzwx_ebxpneklm7">
         <w:r>
           <w:rPr>
             <w:rFonts w:ascii="Calibri" w:cs="Calibri" w:eastAsia="Calibri" w:hAnsi="Calibri"/>
@@ -369,45 +464,45 @@
           <w:sz w:val="21"/>
           <w:szCs w:val="21"/>
         </w:rPr>
-        <w:t xml:space="preserve">Shipped a production web app: live X ingest, clustering, LLM content forge, Markdown/JSON export.</w:t>
-      </w:r>
-    </w:p>
-    <w:p>
-      <w:pPr>
-        <w:pStyle w:val="ListParagraph"/>
-        <w:numPr>
-          <w:ilvl w:val="0"/>
-          <w:numId w:val="2"/>
-        </w:numPr>
-        <w:spacing w:after="24" w:line="230"/>
-      </w:pPr>
-      <w:r>
-        <w:rPr>
-          <w:rFonts w:ascii="Calibri" w:cs="Calibri" w:eastAsia="Calibri" w:hAnsi="Calibri"/>
-          <w:color w:val="222222"/>
-          <w:sz w:val="21"/>
-          <w:szCs w:val="21"/>
-        </w:rPr>
-        <w:t xml:space="preserve">Built the full loop — Vite/React UI, serverless X + Grok proxies, human-gated export (no auto-post).</w:t>
-      </w:r>
-    </w:p>
-    <w:p>
-      <w:pPr>
-        <w:pStyle w:val="ListParagraph"/>
-        <w:numPr>
-          <w:ilvl w:val="0"/>
-          <w:numId w:val="2"/>
-        </w:numPr>
-        <w:spacing w:after="24" w:line="230"/>
-      </w:pPr>
-      <w:r>
-        <w:rPr>
-          <w:rFonts w:ascii="Calibri" w:cs="Calibri" w:eastAsia="Calibri" w:hAnsi="Calibri"/>
-          <w:color w:val="222222"/>
-          <w:sz w:val="21"/>
-          <w:szCs w:val="21"/>
-        </w:rPr>
-        <w:t xml:space="preserve">Also shipped MakerLog, Regex Forge, and GrokSim as supporting tools; TrendForge is the flagship.</w:t>
+        <w:t xml:space="preserve">Shipped a production web app: live X ingest under a spend cap, one-radar MVP, LLM content forge, human-gated copy export (no auto-post).</w:t>
+      </w:r>
+    </w:p>
+    <w:p>
+      <w:pPr>
+        <w:pStyle w:val="ListParagraph"/>
+        <w:numPr>
+          <w:ilvl w:val="0"/>
+          <w:numId w:val="2"/>
+        </w:numPr>
+        <w:spacing w:after="24" w:line="230"/>
+      </w:pPr>
+      <w:r>
+        <w:rPr>
+          <w:rFonts w:ascii="Calibri" w:cs="Calibri" w:eastAsia="Calibri" w:hAnsi="Calibri"/>
+          <w:color w:val="222222"/>
+          <w:sz w:val="21"/>
+          <w:szCs w:val="21"/>
+        </w:rPr>
+        <w:t xml:space="preserve">Built the full loop — Vite/React UI, serverless X + Grok proxies, review gate before anything leaves the building.</w:t>
+      </w:r>
+    </w:p>
+    <w:p>
+      <w:pPr>
+        <w:pStyle w:val="ListParagraph"/>
+        <w:numPr>
+          <w:ilvl w:val="0"/>
+          <w:numId w:val="2"/>
+        </w:numPr>
+        <w:spacing w:after="24" w:line="230"/>
+      </w:pPr>
+      <w:r>
+        <w:rPr>
+          <w:rFonts w:ascii="Calibri" w:cs="Calibri" w:eastAsia="Calibri" w:hAnsi="Calibri"/>
+          <w:color w:val="222222"/>
+          <w:sz w:val="21"/>
+          <w:szCs w:val="21"/>
+        </w:rPr>
+        <w:t xml:space="preserve">Also shipped MakerLog, Regex Forge, GrokSim, and Grok DOOM as supporting / experimental tools.</w:t>
       </w:r>
     </w:p>
     <w:p>

</xml_diff>